<commit_message>
fix(product-emission): coberturas en filas fijas del .docx original
El loop docxtemplater dentro de un solo párrafo con tabs concatenaba nombres
y primas. Se restauran 7 slots fijos (cov0-cov6) como en La Mundial.

Co-authored-by: Cursor <cursoragent@cursor.com>
</commit_message>
<xml_diff>
--- a/src/assets/product-emission/templates/certificado-automovil.template.docx
+++ b/src/assets/product-emission/templates/certificado-automovil.template.docx
@@ -3426,7 +3426,7 @@
           <w:b/>
           <w:sz w:val="12"/>
         </w:rPr>
-        <w:t>{#coberturas}{name}</w:t>
+        <w:t>{cov0Nombre}</w:t>
       </w:r>
       <w:r>
         <w:rPr>
@@ -3448,7 +3448,7 @@
           <w:rFonts w:ascii="Arial MT" w:hAnsi="Arial MT"/>
           <w:sz w:val="12"/>
         </w:rPr>
-        <w:t>{suma}</w:t>
+        <w:t>{cov0Suma}</w:t>
       </w:r>
       <w:r>
         <w:rPr>
@@ -3456,7 +3456,7 @@
           <w:spacing w:val="46"/>
           <w:sz w:val="12"/>
         </w:rPr>
-        <w:t>  </w:t>
+        <w:t/>
       </w:r>
       <w:r>
         <w:rPr>
@@ -3464,7 +3464,7 @@
           <w:spacing w:val="-5"/>
           <w:sz w:val="12"/>
         </w:rPr>
-        <w:t>{covTag}</w:t>
+        <w:t>{cov0Tag}</w:t>
       </w:r>
       <w:r>
         <w:rPr>
@@ -3479,7 +3479,462 @@
           <w:spacing w:val="-4"/>
           <w:sz w:val="12"/>
         </w:rPr>
-        <w:t>{prima}{/coberturas}</w:t>
+        <w:t>{cov0Prima}</w:t>
+      </w:r>
+    </w:p>
+    <w:p>
+      <w:pPr>
+        <w:tabs>
+          <w:tab w:pos="7559" w:val="left" w:leader="none"/>
+          <w:tab w:pos="9726" w:val="left" w:leader="none"/>
+        </w:tabs>
+        <w:spacing w:before="12"/>
+        <w:ind w:left="42" w:right="0" w:firstLine="0"/>
+        <w:jc w:val="left"/>
+        <w:rPr>
+          <w:rFonts w:ascii="Arial MT" w:hAnsi="Arial MT"/>
+          <w:sz w:val="12"/>
+        </w:rPr>
+      </w:pPr>
+      <w:r>
+        <w:rPr>
+          <w:b/>
+          <w:sz w:val="12"/>
+        </w:rPr>
+        <w:t>{cov1Nombre}</w:t>
+      </w:r>
+      <w:r>
+        <w:rPr>
+          <w:b/>
+          <w:spacing w:val="-2"/>
+          <w:sz w:val="12"/>
+        </w:rPr>
+        <w:t/>
+      </w:r>
+      <w:r>
+        <w:rPr>
+          <w:b/>
+          <w:sz w:val="12"/>
+        </w:rPr>
+        <w:tab/>
+      </w:r>
+      <w:r>
+        <w:rPr>
+          <w:rFonts w:ascii="Arial MT" w:hAnsi="Arial MT"/>
+          <w:sz w:val="12"/>
+        </w:rPr>
+        <w:t>{cov1Suma}</w:t>
+      </w:r>
+      <w:r>
+        <w:rPr>
+          <w:rFonts w:ascii="Arial MT" w:hAnsi="Arial MT"/>
+          <w:spacing w:val="46"/>
+          <w:sz w:val="12"/>
+        </w:rPr>
+        <w:t/>
+      </w:r>
+      <w:r>
+        <w:rPr>
+          <w:rFonts w:ascii="Arial MT" w:hAnsi="Arial MT"/>
+          <w:spacing w:val="-5"/>
+          <w:sz w:val="12"/>
+        </w:rPr>
+        <w:t>{cov1Tag}</w:t>
+      </w:r>
+      <w:r>
+        <w:rPr>
+          <w:rFonts w:ascii="Arial MT" w:hAnsi="Arial MT"/>
+          <w:sz w:val="12"/>
+        </w:rPr>
+        <w:tab/>
+      </w:r>
+      <w:r>
+        <w:rPr>
+          <w:rFonts w:ascii="Arial MT" w:hAnsi="Arial MT"/>
+          <w:spacing w:val="-4"/>
+          <w:sz w:val="12"/>
+        </w:rPr>
+        <w:t>{cov1Prima}</w:t>
+      </w:r>
+    </w:p>
+    <w:p>
+      <w:pPr>
+        <w:tabs>
+          <w:tab w:pos="7559" w:val="left" w:leader="none"/>
+          <w:tab w:pos="8366" w:val="left" w:leader="none"/>
+          <w:tab w:pos="9726" w:val="left" w:leader="none"/>
+        </w:tabs>
+        <w:spacing w:before="12"/>
+        <w:ind w:left="42" w:right="0" w:firstLine="0"/>
+        <w:jc w:val="left"/>
+        <w:rPr>
+          <w:rFonts w:ascii="Arial MT"/>
+          <w:sz w:val="12"/>
+        </w:rPr>
+      </w:pPr>
+      <w:r>
+        <w:rPr>
+          <w:b/>
+          <w:sz w:val="12"/>
+        </w:rPr>
+        <w:t>{cov2Nombre}</w:t>
+      </w:r>
+      <w:r>
+        <w:rPr>
+          <w:b/>
+          <w:spacing w:val="-2"/>
+          <w:sz w:val="12"/>
+        </w:rPr>
+        <w:t/>
+      </w:r>
+      <w:r>
+        <w:rPr>
+          <w:b/>
+          <w:sz w:val="12"/>
+        </w:rPr>
+        <w:tab/>
+      </w:r>
+      <w:r>
+        <w:rPr>
+          <w:rFonts w:ascii="Arial MT"/>
+          <w:spacing w:val="-2"/>
+          <w:sz w:val="12"/>
+        </w:rPr>
+        <w:t>{cov2Suma}</w:t>
+      </w:r>
+      <w:r>
+        <w:rPr>
+          <w:rFonts w:ascii="Arial MT"/>
+          <w:sz w:val="12"/>
+        </w:rPr>
+        <w:tab/>
+      </w:r>
+      <w:r>
+        <w:rPr>
+          <w:rFonts w:ascii="Arial MT"/>
+          <w:spacing w:val="-10"/>
+          <w:sz w:val="12"/>
+        </w:rPr>
+        <w:t>{cov2Tag}</w:t>
+      </w:r>
+      <w:r>
+        <w:rPr>
+          <w:rFonts w:ascii="Arial MT"/>
+          <w:sz w:val="12"/>
+        </w:rPr>
+        <w:tab/>
+      </w:r>
+      <w:r>
+        <w:rPr>
+          <w:rFonts w:ascii="Arial MT"/>
+          <w:spacing w:val="-4"/>
+          <w:sz w:val="12"/>
+        </w:rPr>
+        <w:t>{cov2Prima}</w:t>
+      </w:r>
+    </w:p>
+    <w:p>
+      <w:pPr>
+        <w:tabs>
+          <w:tab w:pos="7559" w:val="left" w:leader="none"/>
+          <w:tab w:pos="8366" w:val="left" w:leader="none"/>
+          <w:tab w:pos="9726" w:val="left" w:leader="none"/>
+        </w:tabs>
+        <w:spacing w:before="13"/>
+        <w:ind w:left="42" w:right="0" w:firstLine="0"/>
+        <w:jc w:val="left"/>
+        <w:rPr>
+          <w:rFonts w:ascii="Arial MT"/>
+          <w:sz w:val="12"/>
+        </w:rPr>
+      </w:pPr>
+      <w:r>
+        <w:rPr>
+          <w:b/>
+          <w:sz w:val="12"/>
+        </w:rPr>
+        <w:t>{cov3Nombre}</w:t>
+      </w:r>
+      <w:r>
+        <w:rPr>
+          <w:b/>
+          <w:spacing w:val="-2"/>
+          <w:sz w:val="12"/>
+        </w:rPr>
+        <w:t/>
+      </w:r>
+      <w:r>
+        <w:rPr>
+          <w:b/>
+          <w:sz w:val="12"/>
+        </w:rPr>
+        <w:tab/>
+      </w:r>
+      <w:r>
+        <w:rPr>
+          <w:rFonts w:ascii="Arial MT"/>
+          <w:spacing w:val="-2"/>
+          <w:sz w:val="12"/>
+        </w:rPr>
+        <w:t>{cov3Suma}</w:t>
+      </w:r>
+      <w:r>
+        <w:rPr>
+          <w:rFonts w:ascii="Arial MT"/>
+          <w:sz w:val="12"/>
+        </w:rPr>
+        <w:tab/>
+      </w:r>
+      <w:r>
+        <w:rPr>
+          <w:rFonts w:ascii="Arial MT"/>
+          <w:spacing w:val="-10"/>
+          <w:sz w:val="12"/>
+        </w:rPr>
+        <w:t>{cov3Tag}</w:t>
+      </w:r>
+      <w:r>
+        <w:rPr>
+          <w:rFonts w:ascii="Arial MT"/>
+          <w:sz w:val="12"/>
+        </w:rPr>
+        <w:tab/>
+      </w:r>
+      <w:r>
+        <w:rPr>
+          <w:rFonts w:ascii="Arial MT"/>
+          <w:spacing w:val="-4"/>
+          <w:sz w:val="12"/>
+        </w:rPr>
+        <w:t>{cov3Prima}</w:t>
+      </w:r>
+    </w:p>
+    <w:p>
+      <w:pPr>
+        <w:tabs>
+          <w:tab w:pos="7559" w:val="left" w:leader="none"/>
+          <w:tab w:pos="8366" w:val="left" w:leader="none"/>
+          <w:tab w:pos="9726" w:val="left" w:leader="none"/>
+        </w:tabs>
+        <w:spacing w:before="12"/>
+        <w:ind w:left="42" w:right="0" w:firstLine="0"/>
+        <w:jc w:val="left"/>
+        <w:rPr>
+          <w:rFonts w:ascii="Arial MT"/>
+          <w:sz w:val="12"/>
+        </w:rPr>
+      </w:pPr>
+      <w:r>
+        <w:rPr>
+          <w:b/>
+          <w:sz w:val="12"/>
+        </w:rPr>
+        <w:t>{cov4Nombre}</w:t>
+      </w:r>
+      <w:r>
+        <w:rPr>
+          <w:b/>
+          <w:spacing w:val="-2"/>
+          <w:sz w:val="12"/>
+        </w:rPr>
+        <w:t/>
+      </w:r>
+      <w:r>
+        <w:rPr>
+          <w:b/>
+          <w:sz w:val="12"/>
+        </w:rPr>
+        <w:tab/>
+      </w:r>
+      <w:r>
+        <w:rPr>
+          <w:rFonts w:ascii="Arial MT"/>
+          <w:spacing w:val="-2"/>
+          <w:sz w:val="12"/>
+        </w:rPr>
+        <w:t>{cov4Suma}</w:t>
+      </w:r>
+      <w:r>
+        <w:rPr>
+          <w:rFonts w:ascii="Arial MT"/>
+          <w:sz w:val="12"/>
+        </w:rPr>
+        <w:tab/>
+      </w:r>
+      <w:r>
+        <w:rPr>
+          <w:rFonts w:ascii="Arial MT"/>
+          <w:spacing w:val="-10"/>
+          <w:sz w:val="12"/>
+        </w:rPr>
+        <w:t>{cov4Tag}</w:t>
+      </w:r>
+      <w:r>
+        <w:rPr>
+          <w:rFonts w:ascii="Arial MT"/>
+          <w:sz w:val="12"/>
+        </w:rPr>
+        <w:tab/>
+      </w:r>
+      <w:r>
+        <w:rPr>
+          <w:rFonts w:ascii="Arial MT"/>
+          <w:spacing w:val="-4"/>
+          <w:sz w:val="12"/>
+        </w:rPr>
+        <w:t>{cov4Prima}</w:t>
+      </w:r>
+    </w:p>
+    <w:p>
+      <w:pPr>
+        <w:tabs>
+          <w:tab w:pos="7559" w:val="left" w:leader="none"/>
+          <w:tab w:pos="8366" w:val="left" w:leader="none"/>
+          <w:tab w:pos="9726" w:val="left" w:leader="none"/>
+        </w:tabs>
+        <w:spacing w:before="12"/>
+        <w:ind w:left="42" w:right="0" w:firstLine="0"/>
+        <w:jc w:val="left"/>
+        <w:rPr>
+          <w:rFonts w:ascii="Arial MT"/>
+          <w:sz w:val="12"/>
+        </w:rPr>
+      </w:pPr>
+      <w:r>
+        <w:rPr>
+          <w:b/>
+          <w:sz w:val="12"/>
+        </w:rPr>
+        <w:t>{cov5Nombre}</w:t>
+      </w:r>
+      <w:r>
+        <w:rPr>
+          <w:b/>
+          <w:spacing w:val="-2"/>
+          <w:sz w:val="12"/>
+        </w:rPr>
+        <w:t/>
+      </w:r>
+      <w:r>
+        <w:rPr>
+          <w:b/>
+          <w:sz w:val="12"/>
+        </w:rPr>
+        <w:tab/>
+      </w:r>
+      <w:r>
+        <w:rPr>
+          <w:rFonts w:ascii="Arial MT"/>
+          <w:spacing w:val="-2"/>
+          <w:sz w:val="12"/>
+        </w:rPr>
+        <w:t>{cov5Suma}</w:t>
+      </w:r>
+      <w:r>
+        <w:rPr>
+          <w:rFonts w:ascii="Arial MT"/>
+          <w:sz w:val="12"/>
+        </w:rPr>
+        <w:tab/>
+      </w:r>
+      <w:r>
+        <w:rPr>
+          <w:rFonts w:ascii="Arial MT"/>
+          <w:spacing w:val="-10"/>
+          <w:sz w:val="12"/>
+        </w:rPr>
+        <w:t>{cov5Tag}</w:t>
+      </w:r>
+      <w:r>
+        <w:rPr>
+          <w:rFonts w:ascii="Arial MT"/>
+          <w:sz w:val="12"/>
+        </w:rPr>
+        <w:tab/>
+      </w:r>
+      <w:r>
+        <w:rPr>
+          <w:rFonts w:ascii="Arial MT"/>
+          <w:spacing w:val="-4"/>
+          <w:sz w:val="12"/>
+        </w:rPr>
+        <w:t>{cov5Prima}</w:t>
+      </w:r>
+    </w:p>
+    <w:p>
+      <w:pPr>
+        <w:tabs>
+          <w:tab w:pos="7559" w:val="left" w:leader="none"/>
+          <w:tab w:pos="8366" w:val="left" w:leader="none"/>
+          <w:tab w:pos="9659" w:val="left" w:leader="none"/>
+        </w:tabs>
+        <w:spacing w:before="12"/>
+        <w:ind w:left="42" w:right="0" w:firstLine="0"/>
+        <w:jc w:val="left"/>
+        <w:rPr>
+          <w:rFonts w:ascii="Arial MT"/>
+          <w:sz w:val="12"/>
+        </w:rPr>
+      </w:pPr>
+      <w:r>
+        <w:rPr>
+          <w:b/>
+          <w:sz w:val="12"/>
+        </w:rPr>
+        <w:t>{cov6Nombre}</w:t>
+      </w:r>
+      <w:r>
+        <w:rPr>
+          <w:b/>
+          <w:spacing w:val="-2"/>
+          <w:sz w:val="12"/>
+        </w:rPr>
+        <w:t/>
+      </w:r>
+      <w:r>
+        <w:rPr>
+          <w:b/>
+          <w:sz w:val="12"/>
+        </w:rPr>
+        <w:tab/>
+      </w:r>
+      <w:r>
+        <w:rPr>
+          <w:rFonts w:ascii="Arial MT"/>
+          <w:spacing w:val="-2"/>
+          <w:sz w:val="12"/>
+        </w:rPr>
+        <w:t>{cov6Suma}</w:t>
+      </w:r>
+      <w:r>
+        <w:rPr>
+          <w:rFonts w:ascii="Arial MT"/>
+          <w:sz w:val="12"/>
+        </w:rPr>
+        <w:tab/>
+      </w:r>
+      <w:r>
+        <w:rPr>
+          <w:rFonts w:ascii="Arial MT"/>
+          <w:spacing w:val="-10"/>
+          <w:sz w:val="12"/>
+        </w:rPr>
+        <w:t>{cov6Tag}</w:t>
+      </w:r>
+      <w:r>
+        <w:rPr>
+          <w:rFonts w:ascii="Arial MT"/>
+          <w:sz w:val="12"/>
+        </w:rPr>
+        <w:tab/>
+      </w:r>
+      <w:r>
+        <w:rPr>
+          <w:rFonts w:ascii="Arial MT"/>
+          <w:spacing w:val="-2"/>
+          <w:sz w:val="12"/>
+        </w:rPr>
+        <w:t>{cov6Prima}</w:t>
       </w:r>
     </w:p>
     <w:p>
@@ -8370,7 +8825,7 @@
           <w:b/>
           <w:sz w:val="12"/>
         </w:rPr>
-        <w:t>{#coberturas}{name}</w:t>
+        <w:t>{cov0Nombre}</w:t>
       </w:r>
       <w:r>
         <w:rPr>
@@ -8392,7 +8847,7 @@
           <w:rFonts w:ascii="Arial MT" w:hAnsi="Arial MT"/>
           <w:sz w:val="12"/>
         </w:rPr>
-        <w:t>{suma}</w:t>
+        <w:t>{cov0Suma}</w:t>
       </w:r>
       <w:r>
         <w:rPr>
@@ -8400,7 +8855,7 @@
           <w:spacing w:val="46"/>
           <w:sz w:val="12"/>
         </w:rPr>
-        <w:t>  </w:t>
+        <w:t/>
       </w:r>
       <w:r>
         <w:rPr>
@@ -8408,7 +8863,7 @@
           <w:spacing w:val="-5"/>
           <w:sz w:val="12"/>
         </w:rPr>
-        <w:t>{covTag}</w:t>
+        <w:t>{cov0Tag}</w:t>
       </w:r>
       <w:r>
         <w:rPr>
@@ -8423,7 +8878,462 @@
           <w:spacing w:val="-4"/>
           <w:sz w:val="12"/>
         </w:rPr>
-        <w:t>{prima}{/coberturas}</w:t>
+        <w:t>{cov0Prima}</w:t>
+      </w:r>
+    </w:p>
+    <w:p>
+      <w:pPr>
+        <w:tabs>
+          <w:tab w:pos="7559" w:val="left" w:leader="none"/>
+          <w:tab w:pos="9726" w:val="left" w:leader="none"/>
+        </w:tabs>
+        <w:spacing w:before="12"/>
+        <w:ind w:left="42" w:right="0" w:firstLine="0"/>
+        <w:jc w:val="left"/>
+        <w:rPr>
+          <w:rFonts w:ascii="Arial MT" w:hAnsi="Arial MT"/>
+          <w:sz w:val="12"/>
+        </w:rPr>
+      </w:pPr>
+      <w:r>
+        <w:rPr>
+          <w:b/>
+          <w:sz w:val="12"/>
+        </w:rPr>
+        <w:t>{cov1Nombre}</w:t>
+      </w:r>
+      <w:r>
+        <w:rPr>
+          <w:b/>
+          <w:spacing w:val="-2"/>
+          <w:sz w:val="12"/>
+        </w:rPr>
+        <w:t/>
+      </w:r>
+      <w:r>
+        <w:rPr>
+          <w:b/>
+          <w:sz w:val="12"/>
+        </w:rPr>
+        <w:tab/>
+      </w:r>
+      <w:r>
+        <w:rPr>
+          <w:rFonts w:ascii="Arial MT" w:hAnsi="Arial MT"/>
+          <w:sz w:val="12"/>
+        </w:rPr>
+        <w:t>{cov1Suma}</w:t>
+      </w:r>
+      <w:r>
+        <w:rPr>
+          <w:rFonts w:ascii="Arial MT" w:hAnsi="Arial MT"/>
+          <w:spacing w:val="46"/>
+          <w:sz w:val="12"/>
+        </w:rPr>
+        <w:t/>
+      </w:r>
+      <w:r>
+        <w:rPr>
+          <w:rFonts w:ascii="Arial MT" w:hAnsi="Arial MT"/>
+          <w:spacing w:val="-5"/>
+          <w:sz w:val="12"/>
+        </w:rPr>
+        <w:t>{cov1Tag}</w:t>
+      </w:r>
+      <w:r>
+        <w:rPr>
+          <w:rFonts w:ascii="Arial MT" w:hAnsi="Arial MT"/>
+          <w:sz w:val="12"/>
+        </w:rPr>
+        <w:tab/>
+      </w:r>
+      <w:r>
+        <w:rPr>
+          <w:rFonts w:ascii="Arial MT" w:hAnsi="Arial MT"/>
+          <w:spacing w:val="-4"/>
+          <w:sz w:val="12"/>
+        </w:rPr>
+        <w:t>{cov1Prima}</w:t>
+      </w:r>
+    </w:p>
+    <w:p>
+      <w:pPr>
+        <w:tabs>
+          <w:tab w:pos="7559" w:val="left" w:leader="none"/>
+          <w:tab w:pos="8366" w:val="left" w:leader="none"/>
+          <w:tab w:pos="9726" w:val="left" w:leader="none"/>
+        </w:tabs>
+        <w:spacing w:before="12"/>
+        <w:ind w:left="42" w:right="0" w:firstLine="0"/>
+        <w:jc w:val="left"/>
+        <w:rPr>
+          <w:rFonts w:ascii="Arial MT"/>
+          <w:sz w:val="12"/>
+        </w:rPr>
+      </w:pPr>
+      <w:r>
+        <w:rPr>
+          <w:b/>
+          <w:sz w:val="12"/>
+        </w:rPr>
+        <w:t>{cov2Nombre}</w:t>
+      </w:r>
+      <w:r>
+        <w:rPr>
+          <w:b/>
+          <w:spacing w:val="-2"/>
+          <w:sz w:val="12"/>
+        </w:rPr>
+        <w:t/>
+      </w:r>
+      <w:r>
+        <w:rPr>
+          <w:b/>
+          <w:sz w:val="12"/>
+        </w:rPr>
+        <w:tab/>
+      </w:r>
+      <w:r>
+        <w:rPr>
+          <w:rFonts w:ascii="Arial MT"/>
+          <w:spacing w:val="-2"/>
+          <w:sz w:val="12"/>
+        </w:rPr>
+        <w:t>{cov2Suma}</w:t>
+      </w:r>
+      <w:r>
+        <w:rPr>
+          <w:rFonts w:ascii="Arial MT"/>
+          <w:sz w:val="12"/>
+        </w:rPr>
+        <w:tab/>
+      </w:r>
+      <w:r>
+        <w:rPr>
+          <w:rFonts w:ascii="Arial MT"/>
+          <w:spacing w:val="-10"/>
+          <w:sz w:val="12"/>
+        </w:rPr>
+        <w:t>{cov2Tag}</w:t>
+      </w:r>
+      <w:r>
+        <w:rPr>
+          <w:rFonts w:ascii="Arial MT"/>
+          <w:sz w:val="12"/>
+        </w:rPr>
+        <w:tab/>
+      </w:r>
+      <w:r>
+        <w:rPr>
+          <w:rFonts w:ascii="Arial MT"/>
+          <w:spacing w:val="-4"/>
+          <w:sz w:val="12"/>
+        </w:rPr>
+        <w:t>{cov2Prima}</w:t>
+      </w:r>
+    </w:p>
+    <w:p>
+      <w:pPr>
+        <w:tabs>
+          <w:tab w:pos="7559" w:val="left" w:leader="none"/>
+          <w:tab w:pos="8366" w:val="left" w:leader="none"/>
+          <w:tab w:pos="9726" w:val="left" w:leader="none"/>
+        </w:tabs>
+        <w:spacing w:before="13"/>
+        <w:ind w:left="42" w:right="0" w:firstLine="0"/>
+        <w:jc w:val="left"/>
+        <w:rPr>
+          <w:rFonts w:ascii="Arial MT"/>
+          <w:sz w:val="12"/>
+        </w:rPr>
+      </w:pPr>
+      <w:r>
+        <w:rPr>
+          <w:b/>
+          <w:sz w:val="12"/>
+        </w:rPr>
+        <w:t>{cov3Nombre}</w:t>
+      </w:r>
+      <w:r>
+        <w:rPr>
+          <w:b/>
+          <w:spacing w:val="-2"/>
+          <w:sz w:val="12"/>
+        </w:rPr>
+        <w:t/>
+      </w:r>
+      <w:r>
+        <w:rPr>
+          <w:b/>
+          <w:sz w:val="12"/>
+        </w:rPr>
+        <w:tab/>
+      </w:r>
+      <w:r>
+        <w:rPr>
+          <w:rFonts w:ascii="Arial MT"/>
+          <w:spacing w:val="-2"/>
+          <w:sz w:val="12"/>
+        </w:rPr>
+        <w:t>{cov3Suma}</w:t>
+      </w:r>
+      <w:r>
+        <w:rPr>
+          <w:rFonts w:ascii="Arial MT"/>
+          <w:sz w:val="12"/>
+        </w:rPr>
+        <w:tab/>
+      </w:r>
+      <w:r>
+        <w:rPr>
+          <w:rFonts w:ascii="Arial MT"/>
+          <w:spacing w:val="-10"/>
+          <w:sz w:val="12"/>
+        </w:rPr>
+        <w:t>{cov3Tag}</w:t>
+      </w:r>
+      <w:r>
+        <w:rPr>
+          <w:rFonts w:ascii="Arial MT"/>
+          <w:sz w:val="12"/>
+        </w:rPr>
+        <w:tab/>
+      </w:r>
+      <w:r>
+        <w:rPr>
+          <w:rFonts w:ascii="Arial MT"/>
+          <w:spacing w:val="-4"/>
+          <w:sz w:val="12"/>
+        </w:rPr>
+        <w:t>{cov3Prima}</w:t>
+      </w:r>
+    </w:p>
+    <w:p>
+      <w:pPr>
+        <w:tabs>
+          <w:tab w:pos="7559" w:val="left" w:leader="none"/>
+          <w:tab w:pos="8366" w:val="left" w:leader="none"/>
+          <w:tab w:pos="9726" w:val="left" w:leader="none"/>
+        </w:tabs>
+        <w:spacing w:before="12"/>
+        <w:ind w:left="42" w:right="0" w:firstLine="0"/>
+        <w:jc w:val="left"/>
+        <w:rPr>
+          <w:rFonts w:ascii="Arial MT"/>
+          <w:sz w:val="12"/>
+        </w:rPr>
+      </w:pPr>
+      <w:r>
+        <w:rPr>
+          <w:b/>
+          <w:sz w:val="12"/>
+        </w:rPr>
+        <w:t>{cov4Nombre}</w:t>
+      </w:r>
+      <w:r>
+        <w:rPr>
+          <w:b/>
+          <w:spacing w:val="-2"/>
+          <w:sz w:val="12"/>
+        </w:rPr>
+        <w:t/>
+      </w:r>
+      <w:r>
+        <w:rPr>
+          <w:b/>
+          <w:sz w:val="12"/>
+        </w:rPr>
+        <w:tab/>
+      </w:r>
+      <w:r>
+        <w:rPr>
+          <w:rFonts w:ascii="Arial MT"/>
+          <w:spacing w:val="-2"/>
+          <w:sz w:val="12"/>
+        </w:rPr>
+        <w:t>{cov4Suma}</w:t>
+      </w:r>
+      <w:r>
+        <w:rPr>
+          <w:rFonts w:ascii="Arial MT"/>
+          <w:sz w:val="12"/>
+        </w:rPr>
+        <w:tab/>
+      </w:r>
+      <w:r>
+        <w:rPr>
+          <w:rFonts w:ascii="Arial MT"/>
+          <w:spacing w:val="-10"/>
+          <w:sz w:val="12"/>
+        </w:rPr>
+        <w:t>{cov4Tag}</w:t>
+      </w:r>
+      <w:r>
+        <w:rPr>
+          <w:rFonts w:ascii="Arial MT"/>
+          <w:sz w:val="12"/>
+        </w:rPr>
+        <w:tab/>
+      </w:r>
+      <w:r>
+        <w:rPr>
+          <w:rFonts w:ascii="Arial MT"/>
+          <w:spacing w:val="-4"/>
+          <w:sz w:val="12"/>
+        </w:rPr>
+        <w:t>{cov4Prima}</w:t>
+      </w:r>
+    </w:p>
+    <w:p>
+      <w:pPr>
+        <w:tabs>
+          <w:tab w:pos="7559" w:val="left" w:leader="none"/>
+          <w:tab w:pos="8366" w:val="left" w:leader="none"/>
+          <w:tab w:pos="9726" w:val="left" w:leader="none"/>
+        </w:tabs>
+        <w:spacing w:before="12"/>
+        <w:ind w:left="42" w:right="0" w:firstLine="0"/>
+        <w:jc w:val="left"/>
+        <w:rPr>
+          <w:rFonts w:ascii="Arial MT"/>
+          <w:sz w:val="12"/>
+        </w:rPr>
+      </w:pPr>
+      <w:r>
+        <w:rPr>
+          <w:b/>
+          <w:sz w:val="12"/>
+        </w:rPr>
+        <w:t>{cov5Nombre}</w:t>
+      </w:r>
+      <w:r>
+        <w:rPr>
+          <w:b/>
+          <w:spacing w:val="-2"/>
+          <w:sz w:val="12"/>
+        </w:rPr>
+        <w:t/>
+      </w:r>
+      <w:r>
+        <w:rPr>
+          <w:b/>
+          <w:sz w:val="12"/>
+        </w:rPr>
+        <w:tab/>
+      </w:r>
+      <w:r>
+        <w:rPr>
+          <w:rFonts w:ascii="Arial MT"/>
+          <w:spacing w:val="-2"/>
+          <w:sz w:val="12"/>
+        </w:rPr>
+        <w:t>{cov5Suma}</w:t>
+      </w:r>
+      <w:r>
+        <w:rPr>
+          <w:rFonts w:ascii="Arial MT"/>
+          <w:sz w:val="12"/>
+        </w:rPr>
+        <w:tab/>
+      </w:r>
+      <w:r>
+        <w:rPr>
+          <w:rFonts w:ascii="Arial MT"/>
+          <w:spacing w:val="-10"/>
+          <w:sz w:val="12"/>
+        </w:rPr>
+        <w:t>{cov5Tag}</w:t>
+      </w:r>
+      <w:r>
+        <w:rPr>
+          <w:rFonts w:ascii="Arial MT"/>
+          <w:sz w:val="12"/>
+        </w:rPr>
+        <w:tab/>
+      </w:r>
+      <w:r>
+        <w:rPr>
+          <w:rFonts w:ascii="Arial MT"/>
+          <w:spacing w:val="-4"/>
+          <w:sz w:val="12"/>
+        </w:rPr>
+        <w:t>{cov5Prima}</w:t>
+      </w:r>
+    </w:p>
+    <w:p>
+      <w:pPr>
+        <w:tabs>
+          <w:tab w:pos="7559" w:val="left" w:leader="none"/>
+          <w:tab w:pos="8366" w:val="left" w:leader="none"/>
+          <w:tab w:pos="9659" w:val="left" w:leader="none"/>
+        </w:tabs>
+        <w:spacing w:before="12"/>
+        <w:ind w:left="42" w:right="0" w:firstLine="0"/>
+        <w:jc w:val="left"/>
+        <w:rPr>
+          <w:rFonts w:ascii="Arial MT"/>
+          <w:sz w:val="12"/>
+        </w:rPr>
+      </w:pPr>
+      <w:r>
+        <w:rPr>
+          <w:b/>
+          <w:sz w:val="12"/>
+        </w:rPr>
+        <w:t>{cov6Nombre}</w:t>
+      </w:r>
+      <w:r>
+        <w:rPr>
+          <w:b/>
+          <w:spacing w:val="-2"/>
+          <w:sz w:val="12"/>
+        </w:rPr>
+        <w:t/>
+      </w:r>
+      <w:r>
+        <w:rPr>
+          <w:b/>
+          <w:sz w:val="12"/>
+        </w:rPr>
+        <w:tab/>
+      </w:r>
+      <w:r>
+        <w:rPr>
+          <w:rFonts w:ascii="Arial MT"/>
+          <w:spacing w:val="-2"/>
+          <w:sz w:val="12"/>
+        </w:rPr>
+        <w:t>{cov6Suma}</w:t>
+      </w:r>
+      <w:r>
+        <w:rPr>
+          <w:rFonts w:ascii="Arial MT"/>
+          <w:sz w:val="12"/>
+        </w:rPr>
+        <w:tab/>
+      </w:r>
+      <w:r>
+        <w:rPr>
+          <w:rFonts w:ascii="Arial MT"/>
+          <w:spacing w:val="-10"/>
+          <w:sz w:val="12"/>
+        </w:rPr>
+        <w:t>{cov6Tag}</w:t>
+      </w:r>
+      <w:r>
+        <w:rPr>
+          <w:rFonts w:ascii="Arial MT"/>
+          <w:sz w:val="12"/>
+        </w:rPr>
+        <w:tab/>
+      </w:r>
+      <w:r>
+        <w:rPr>
+          <w:rFonts w:ascii="Arial MT"/>
+          <w:spacing w:val="-2"/>
+          <w:sz w:val="12"/>
+        </w:rPr>
+        <w:t>{cov6Prima}</w:t>
       </w:r>
     </w:p>
     <w:p>

</xml_diff>